<commit_message>
Fix Business Clearance fee alignment and other updates
</commit_message>
<xml_diff>
--- a/BarangayVillaMTejeroSystem/Templates/BarangayClearanceForBusiness.docx
+++ b/BarangayVillaMTejeroSystem/Templates/BarangayClearanceForBusiness.docx
@@ -490,28 +490,23 @@
     <w:p>
       <w:pPr>
         <w:pStyle w:val="NoSpacing"/>
-        <w:numPr>
-          <w:ilvl w:val="0"/>
-          <w:numId w:val="1"/>
-        </w:numPr>
-        <w:rPr>
-          <w:rFonts w:asciiTheme="majorHAnsi" w:hAnsiTheme="majorHAnsi"/>
-          <w:sz w:val="24"/>
-          <w:szCs w:val="24"/>
-        </w:rPr>
-      </w:pPr>
-      <w:r>
-        <w:rPr>
-          <w:rFonts w:asciiTheme="majorHAnsi" w:hAnsiTheme="majorHAnsi"/>
-          <w:sz w:val="24"/>
-          <w:szCs w:val="24"/>
-        </w:rPr>
-        <w:t xml:space="preserve">[BUSINESSTYPE] </w:t>
-        <w:tab/>
-        <w:tab/>
-        <w:tab/>
-        <w:tab/>
-        <w:t xml:space="preserve">                                        [FEE]</w:t>
+        <w:tabs>
+          <w:tab w:val="right" w:pos="9360"/>
+        </w:tabs>
+        <w:ind w:left="720"/>
+        <w:rPr>
+          <w:rFonts w:asciiTheme="majorHAnsi" w:hAnsiTheme="majorHAnsi"/>
+          <w:sz w:val="24"/>
+          <w:szCs w:val="24"/>
+        </w:rPr>
+      </w:pPr>
+      <w:r>
+        <w:rPr>
+          <w:rFonts w:asciiTheme="majorHAnsi" w:hAnsiTheme="majorHAnsi"/>
+          <w:sz w:val="24"/>
+          <w:szCs w:val="24"/>
+        </w:rPr>
+        <w:t xml:space="preserve">[BUSINESSFEEROWS]</w:t>
       </w:r>
     </w:p>
     <w:p>
@@ -579,30 +574,23 @@
     <w:p>
       <w:pPr>
         <w:pStyle w:val="NoSpacing"/>
-        <w:numPr>
-          <w:ilvl w:val="0"/>
-          <w:numId w:val="4"/>
-        </w:numPr>
-        <w:rPr>
-          <w:rFonts w:asciiTheme="majorHAnsi" w:hAnsiTheme="majorHAnsi"/>
-          <w:sz w:val="24"/>
-          <w:szCs w:val="24"/>
-        </w:rPr>
-      </w:pPr>
-      <w:r>
-        <w:rPr>
-          <w:rFonts w:asciiTheme="majorHAnsi" w:hAnsiTheme="majorHAnsi"/>
-          <w:sz w:val="24"/>
-          <w:szCs w:val="24"/>
-        </w:rPr>
-        <w:t xml:space="preserve">[BUSINESSTYPE]</w:t>
-        <w:tab/>
-        <w:tab/>
-        <w:tab/>
-        <w:tab/>
-        <w:tab/>
-        <w:tab/>
-        <w:t xml:space="preserve">                     [BUSINESSTAX]</w:t>
+        <w:tabs>
+          <w:tab w:val="right" w:pos="9360"/>
+        </w:tabs>
+        <w:ind w:left="980"/>
+        <w:rPr>
+          <w:rFonts w:asciiTheme="majorHAnsi" w:hAnsiTheme="majorHAnsi"/>
+          <w:sz w:val="24"/>
+          <w:szCs w:val="24"/>
+        </w:rPr>
+      </w:pPr>
+      <w:r>
+        <w:rPr>
+          <w:rFonts w:asciiTheme="majorHAnsi" w:hAnsiTheme="majorHAnsi"/>
+          <w:sz w:val="24"/>
+          <w:szCs w:val="24"/>
+        </w:rPr>
+        <w:t xml:space="preserve">[BUSINESSTAXROWS]</w:t>
       </w:r>
     </w:p>
     <w:p>
@@ -826,7 +814,7 @@
           <w:sz w:val="20"/>
           <w:szCs w:val="20"/>
         </w:rPr>
-        <w:t xml:space="preserve">CTC No. [CONTROLNO]</w:t>
+        <w:t xml:space="preserve">CTC No. [CTCNO]</w:t>
       </w:r>
     </w:p>
     <w:p>
@@ -864,7 +852,7 @@
           <w:sz w:val="20"/>
           <w:szCs w:val="20"/>
         </w:rPr>
-        <w:t xml:space="preserve">Issued On: [DATE]</w:t>
+        <w:t xml:space="preserve">Issued On: [ISSUEDON]</w:t>
       </w:r>
     </w:p>
     <w:p>

</xml_diff>